<commit_message>
Upgrade Healthcare Intelligence to V7.7
</commit_message>
<xml_diff>
--- a/docs/PROJECT_EXECUTION_RECORD.docx
+++ b/docs/PROJECT_EXECUTION_RECORD.docx
@@ -1598,6 +1598,29 @@
         <w:t>User checks: launch updated app; submit integrated finerenone question; verify readable KG labels; inspect evidence links and report. Preserve authentic evidence, HTTPS verification, source provenance and blocking of eligibility, market size and cross-cycle trend claims. No raw NHANES/R rerun or clinical expert review required for this controlled demo.</w:t>
       </w:r>
     </w:p>
+    <w:p>
+      <w:pPr>
+        <w:pStyle w:val="Heading1"/>
+      </w:pPr>
+      <w:r>
+        <w:t>13. V7.7 — Evidence-Grounded Reasoning and Opportunity Funnel</w:t>
+      </w:r>
+    </w:p>
+    <w:p>
+      <w:r>
+        <w:t>Authorized 2026-10-25 after review of V7.6.1 investigation. Implemented new read-only original KG edge traversal; targeted live PubMed searches for FIDELIO-DKD, FIGARO-DKD and FIDELITY; HTTPS PubMed XML abstract retrieval with attributed Results/Conclusions excerpts when available; and a five-stage evidence-requirements funnel without invented eligibility percentages.</w:t>
+      </w:r>
+    </w:p>
+    <w:p>
+      <w:r>
+        <w:t>Safeguards: original KG unchanged, SHA-256 4b43634ec370b1a7b1dfc28e6fbb9458172ba8234959d6c5f5713ad05d6212bf. No simulated biomedical evidence, patient records, unsupported treatment eligibility, commercial market numbers or trend conclusions. Abstract snippets are not independently critically appraised; original KG relations are not clinically adjudicated.</w:t>
+      </w:r>
+    </w:p>
+    <w:p>
+      <w:r>
+        <w:t>Validation: 53 of 53 automated tests passed, including six V7.7-specific fixture-based software tests. Cloud-hosted Streamlit GUI and live PubMed V7.7 retrieval remain pending independent user acceptance. The existing production GitHub repository was not accessed or modified. The separate public demo repository requires user-controlled upload and redeployment.</w:t>
+      </w:r>
+    </w:p>
     <w:sectPr>
       <w:pgSz w:w="12240" w:h="15840"/>
       <w:pgMar w:top="1123" w:right="1210" w:bottom="1037" w:left="1210" w:header="720" w:footer="720" w:gutter="0"/>

</xml_diff>

<commit_message>
V7.7.1 - Improve PubMed reliability and KG reasoning
</commit_message>
<xml_diff>
--- a/docs/PROJECT_EXECUTION_RECORD.docx
+++ b/docs/PROJECT_EXECUTION_RECORD.docx
@@ -1621,6 +1621,29 @@
         <w:t>Validation: 53 of 53 automated tests passed, including six V7.7-specific fixture-based software tests. Cloud-hosted Streamlit GUI and live PubMed V7.7 retrieval remain pending independent user acceptance. The existing production GitHub repository was not accessed or modified. The separate public demo repository requires user-controlled upload and redeployment.</w:t>
       </w:r>
     </w:p>
+    <w:p>
+      <w:pPr>
+        <w:pStyle w:val="Heading1"/>
+      </w:pPr>
+      <w:r>
+        <w:t>V7.7.1 — Targeted corrective release (2026-10-25)</w:t>
+      </w:r>
+    </w:p>
+    <w:p>
+      <w:r>
+        <w:t>Trigger: the V7.7 user-supplied investigation reported HTTP 429 for FIDELIO-DKD, FIGARO-DKD and FIDELITY, despite successful generic PubMed and ClinicalTrials.gov retrieval. KG traversal required improved question relevance.</w:t>
+      </w:r>
+    </w:p>
+    <w:p>
+      <w:r>
+        <w:t>Implementation: batched PubMed pivotal search and summary, bounded HTTP 429/transient 5xx retry with backoff, in-process six-hour caching of successfully retrieved authentic records and abstracts, batched EFetch, and relevance-ranked original KG relationships. Original KG bytes and clinical inference safeguards are preserved.</w:t>
+      </w:r>
+    </w:p>
+    <w:p>
+      <w:r>
+        <w:t>Validation: local automated tests and original KG checksum; live PubMed and Streamlit cloud acceptance remain pending. No fabricated scientific evidence, no TLS bypass, no production GitHub activity. Title-based pivotal study tagging can miss papers without explicit study names. Clinical critical appraisal and validated treatment opportunity remain outside demo scope.</w:t>
+      </w:r>
+    </w:p>
     <w:sectPr>
       <w:pgSz w:w="12240" w:h="15840"/>
       <w:pgMar w:top="1123" w:right="1210" w:bottom="1037" w:left="1210" w:header="720" w:footer="720" w:gutter="0"/>

</xml_diff>

<commit_message>
V7.7.2 - Focused Population Intelligence Update
</commit_message>
<xml_diff>
--- a/docs/PROJECT_EXECUTION_RECORD.docx
+++ b/docs/PROJECT_EXECUTION_RECORD.docx
@@ -1598,6 +1598,70 @@
         <w:t>User checks: launch updated app; submit integrated finerenone question; verify readable KG labels; inspect evidence links and report. Preserve authentic evidence, HTTPS verification, source provenance and blocking of eligibility, market size and cross-cycle trend claims. No raw NHANES/R rerun or clinical expert review required for this controlled demo.</w:t>
       </w:r>
     </w:p>
+    <w:p>
+      <w:pPr>
+        <w:pStyle w:val="Heading1"/>
+      </w:pPr>
+      <w:r>
+        <w:t>13. V7.7 — Evidence-Grounded Reasoning and Opportunity Funnel</w:t>
+      </w:r>
+    </w:p>
+    <w:p>
+      <w:r>
+        <w:t>Authorized 2026-10-25 after review of V7.6.1 investigation. Implemented new read-only original KG edge traversal; targeted live PubMed searches for FIDELIO-DKD, FIGARO-DKD and FIDELITY; HTTPS PubMed XML abstract retrieval with attributed Results/Conclusions excerpts when available; and a five-stage evidence-requirements funnel without invented eligibility percentages.</w:t>
+      </w:r>
+    </w:p>
+    <w:p>
+      <w:r>
+        <w:t>Safeguards: original KG unchanged, SHA-256 4b43634ec370b1a7b1dfc28e6fbb9458172ba8234959d6c5f5713ad05d6212bf. No simulated biomedical evidence, patient records, unsupported treatment eligibility, commercial market numbers or trend conclusions. Abstract snippets are not independently critically appraised; original KG relations are not clinically adjudicated.</w:t>
+      </w:r>
+    </w:p>
+    <w:p>
+      <w:r>
+        <w:t>Validation: 53 of 53 automated tests passed, including six V7.7-specific fixture-based software tests. Cloud-hosted Streamlit GUI and live PubMed V7.7 retrieval remain pending independent user acceptance. The existing production GitHub repository was not accessed or modified. The separate public demo repository requires user-controlled upload and redeployment.</w:t>
+      </w:r>
+    </w:p>
+    <w:p>
+      <w:pPr>
+        <w:pStyle w:val="Heading1"/>
+      </w:pPr>
+      <w:r>
+        <w:t>V7.7.1 — Targeted corrective release (2026-10-25)</w:t>
+      </w:r>
+    </w:p>
+    <w:p>
+      <w:r>
+        <w:t>Trigger: the V7.7 user-supplied investigation reported HTTP 429 for FIDELIO-DKD, FIGARO-DKD and FIDELITY, despite successful generic PubMed and ClinicalTrials.gov retrieval. KG traversal required improved question relevance.</w:t>
+      </w:r>
+    </w:p>
+    <w:p>
+      <w:r>
+        <w:t>Implementation: batched PubMed pivotal search and summary, bounded HTTP 429/transient 5xx retry with backoff, in-process six-hour caching of successfully retrieved authentic records and abstracts, batched EFetch, and relevance-ranked original KG relationships. Original KG bytes and clinical inference safeguards are preserved.</w:t>
+      </w:r>
+    </w:p>
+    <w:p>
+      <w:r>
+        <w:t>Validation: local automated tests and original KG checksum; live PubMed and Streamlit cloud acceptance remain pending. No fabricated scientific evidence, no TLS bypass, no production GitHub activity. Title-based pivotal study tagging can miss papers without explicit study names. Clinical critical appraisal and validated treatment opportunity remain outside demo scope.</w:t>
+      </w:r>
+    </w:p>
+    <w:p>
+      <w:pPr>
+        <w:pStyle w:val="Heading2"/>
+      </w:pPr>
+      <w:r>
+        <w:t>V7.7.2 — Focused population intent routing</w:t>
+      </w:r>
+    </w:p>
+    <w:p>
+      <w:r>
+        <w:t>2026-10-25. The user-provided V7.7.1 population-only report contained the preserved population estimate, count confidence interval, weight, and unweighted cases, but omitted weighted prevalence and included unnecessary clinical KG, PubMed, trial, and pivotal-evidence sections.</w:t>
+      </w:r>
+    </w:p>
+    <w:p>
+      <w:r>
+        <w:t>V7.7.2 adds deterministic population-only intent routing, source-derived complete-case prevalence and denominator, and skips external/clinical evidence tools for this route. The original KG and NHANES source artifacts are unchanged. Integrated questions retain the prior pipeline. Independent NHANES replication, clinical adjudication, and Streamlit Cloud acceptance remain pending.</w:t>
+      </w:r>
+    </w:p>
     <w:sectPr>
       <w:pgSz w:w="12240" w:h="15840"/>
       <w:pgMar w:top="1123" w:right="1210" w:bottom="1037" w:left="1210" w:header="720" w:footer="720" w:gutter="0"/>

</xml_diff>

<commit_message>
V7.7.3 - Clinical Evidence Synthesis Upgrade
</commit_message>
<xml_diff>
--- a/docs/PROJECT_EXECUTION_RECORD.docx
+++ b/docs/PROJECT_EXECUTION_RECORD.docx
@@ -1662,6 +1662,44 @@
         <w:t>V7.7.2 adds deterministic population-only intent routing, source-derived complete-case prevalence and denominator, and skips external/clinical evidence tools for this route. The original KG and NHANES source artifacts are unchanged. Integrated questions retain the prior pipeline. Independent NHANES replication, clinical adjudication, and Streamlit Cloud acceptance remain pending.</w:t>
       </w:r>
     </w:p>
+    <w:p>
+      <w:pPr>
+        <w:pStyle w:val="Heading1"/>
+      </w:pPr>
+      <w:r>
+        <w:t>V7.7.3 — Evidence Interpretation and Version Consistency</w:t>
+      </w:r>
+    </w:p>
+    <w:p>
+      <w:pPr/>
+      <w:r>
+        <w:t>Authorization and scope (25 October 2026). The user approved a focused evidence interpretation upgrade after evaluating the V7.7.2 integrated Kerendia report. Preserve original clinical KG and all existing scientific safeguards.</w:t>
+      </w:r>
+    </w:p>
+    <w:p>
+      <w:pPr/>
+      <w:r>
+        <w:t>Implementation. Added source-attributed study comparisons, transparent title-based publication-type heuristics, complete retrieved abstract sections, readable original KG relationships, an executive synthesis of decision gaps, and a NHANES-to-clinical-evidence applicability matrix. A single release identifier now drives banner, browser title, report headings and downloaded filenames.</w:t>
+      </w:r>
+    </w:p>
+    <w:p>
+      <w:pPr/>
+      <w:r>
+        <w:t>Evidence policy. Publication-type labels are title heuristics requiring verification, not independent trial appraisal. No source-unsupported clinical effects, eligibility counts, market size or cross-cycle trends are generated. Existing population-only intent routing remains intact.</w:t>
+      </w:r>
+    </w:p>
+    <w:p>
+      <w:pPr/>
+      <w:r>
+        <w:t>Local verification. 70 automated tests passed; Python source compiled; original KG SHA-256 4b43634ec370b1a7b1dfc28e6fbb9458172ba8234959d6c5f5713ad05d6212bf unchanged. Live API retrieval and Streamlit Cloud rendering remain to be verified by the user.</w:t>
+      </w:r>
+    </w:p>
+    <w:p>
+      <w:pPr/>
+      <w:r>
+        <w:t>Acceptance pending. Deploy separate V7.7.3-testing branch and Streamlit app, then test the population-only and integrated questions; inspect complete Markdown and evidence JSON; verify filenames and report titles consistently identify V7.7.3.</w:t>
+      </w:r>
+    </w:p>
     <w:sectPr>
       <w:pgSz w:w="12240" w:h="15840"/>
       <w:pgMar w:top="1123" w:right="1210" w:bottom="1037" w:left="1210" w:header="720" w:footer="720" w:gutter="0"/>

</xml_diff>